<commit_message>
Rapport : ajout du reglage gameSpeed dans la partie 7.1
</commit_message>
<xml_diff>
--- a/Rapport_Path_of_the_Knight.docx
+++ b/Rapport_Path_of_the_Knight.docx
@@ -6525,6 +6525,46 @@
       </w:r>
       <w:r>
         <w:t xml:space="preserve"> ferme le jeu (sans effet dans l'éditeur).</w:t>
+      </w:r>
+    </w:p>
+    <w:p>
+      <w:pPr>
+        <w:spacing w:before="120" w:after="120" w:line="300"/>
+      </w:pPr>
+      <w:r>
+        <w:t xml:space="preserve">Le script </w:t>
+      </w:r>
+      <w:r>
+        <w:rPr>
+          <w:b/>
+          <w:bCs/>
+        </w:rPr>
+        <w:t xml:space="preserve">MainMenu</w:t>
+      </w:r>
+      <w:r>
+        <w:t xml:space="preserve"> possède aussi un réglage </w:t>
+      </w:r>
+      <w:r>
+        <w:rPr>
+          <w:b/>
+          <w:bCs/>
+        </w:rPr>
+        <w:t xml:space="preserve">gameSpeed</w:t>
+      </w:r>
+      <w:r>
+        <w:t xml:space="preserve"> (entre 0,25 et 3, modifiable dans l'Inspector) : au clic sur Play, il est appliqué à </w:t>
+      </w:r>
+      <w:r>
+        <w:rPr>
+          <w:rFonts w:ascii="Consolas" w:cs="Consolas" w:eastAsia="Consolas" w:hAnsi="Consolas"/>
+          <w:color w:val="8B1A1A"/>
+          <w:sz w:val="20"/>
+          <w:szCs w:val="20"/>
+        </w:rPr>
+        <w:t xml:space="preserve">Time.timeScale</w:t>
+      </w:r>
+      <w:r>
+        <w:t xml:space="preserve">, ce qui accélère ou ralentit tout le jeu (déplacements, animations, particules, délais) dans toutes les scènes suivantes. Par défaut il vaut 1, la vitesse normale.</w:t>
       </w:r>
     </w:p>
     <w:p>

</xml_diff>